<commit_message>
Consolidamento head KOS: pagine pubblicate per template
Co-Authored-By: Claude Opus 5.5 <noreply@anthropic.com>
Claude-Session: https://claude.ai/code/session_01Rr1X44gsg7BUwMzrRvYrc2
</commit_message>
<xml_diff>
--- a/docs/docx/kos-head-consolidamento.docx
+++ b/docs/docx/kos-head-consolidamento.docx
@@ -2,7 +2,7 @@
 <file path=word/document.xml><?xml version="1.0" encoding="utf-8"?>
 <w:document xmlns:w="http://schemas.openxmlformats.org/wordprocessingml/2006/main" xmlns:m="http://schemas.openxmlformats.org/officeDocument/2006/math" xmlns:r="http://schemas.openxmlformats.org/officeDocument/2006/relationships" xmlns:o="urn:schemas-microsoft-com:office:office" xmlns:v="urn:schemas-microsoft-com:vml" xmlns:w10="urn:schemas-microsoft-com:office:word" xmlns:a="http://schemas.openxmlformats.org/drawingml/2006/main" xmlns:pic="http://schemas.openxmlformats.org/drawingml/2006/picture" xmlns:wp="http://schemas.openxmlformats.org/drawingml/2006/wordprocessingDrawing">
   <w:body>
-    <w:bookmarkStart w:id="25" w:name="X496c23bca27832a92f5d9f0c1a1bc68d849f352"/>
+    <w:bookmarkStart w:id="26" w:name="X496c23bca27832a92f5d9f0c1a1bc68d849f352"/>
     <w:p>
       <w:pPr>
         <w:pStyle w:val="Heading1"/>
@@ -25,7 +25,7 @@
         <w:t xml:space="preserve">insieme alla voce 24 (JSON-LD delle schede e delle landing) e alla rimozione dello script Yext delle schede.</w:t>
       </w:r>
     </w:p>
-    <w:bookmarkStart w:id="20" w:name="stato-attuale"/>
+    <w:bookmarkStart w:id="21" w:name="stato-attuale"/>
     <w:p>
       <w:pPr>
         <w:pStyle w:val="Heading2"/>
@@ -891,8 +891,719 @@
         <w:t xml:space="preserve">con piccole varianti nate nel tempo, non per scelta.</w:t>
       </w:r>
     </w:p>
+    <w:bookmarkStart w:id="20" w:name="X259ebe2b96608471cea27d180aa531d68192942"/>
+    <w:p>
+      <w:pPr>
+        <w:pStyle w:val="Heading3"/>
+      </w:pPr>
+      <w:r>
+        <w:t xml:space="preserve">Pagine per template (produzione, 24/10,</w:t>
+      </w:r>
+      <w:r>
+        <w:t xml:space="preserve"> </w:t>
+      </w:r>
+      <w:r>
+        <w:rPr>
+          <w:rStyle w:val="VerbatimChar"/>
+        </w:rPr>
+        <w:t xml:space="preserve">scripts/checks/risorse-per-template.php</w:t>
+      </w:r>
+      <w:r>
+        <w:t xml:space="preserve">)</w:t>
+      </w:r>
+    </w:p>
+    <w:tbl>
+      <w:tblPr>
+        <w:tblStyle w:val="Table"/>
+        <w:tblW w:type="auto" w:w="0"/>
+        <w:tblLook w:firstRow="1" w:lastRow="0" w:firstColumn="0" w:lastColumn="0" w:noHBand="0" w:noVBand="0" w:val="0020"/>
+        <w:jc w:val="start"/>
+      </w:tblPr>
+      <w:tblGrid>
+        <w:gridCol w:w="2640"/>
+        <w:gridCol w:w="2640"/>
+        <w:gridCol w:w="2640"/>
+      </w:tblGrid>
+      <w:tr>
+        <w:trPr>
+          <w:tblHeader w:val="true"/>
+        </w:trPr>
+        <w:tc>
+          <w:tcPr/>
+          <w:p>
+            <w:pPr>
+              <w:pStyle w:val="Compact"/>
+              <w:jc w:val="left"/>
+            </w:pPr>
+            <w:r>
+              <w:t xml:space="preserve">Template</w:t>
+            </w:r>
+          </w:p>
+        </w:tc>
+        <w:tc>
+          <w:tcPr/>
+          <w:p>
+            <w:pPr>
+              <w:pStyle w:val="Compact"/>
+              <w:jc w:val="left"/>
+            </w:pPr>
+            <w:r>
+              <w:t xml:space="preserve">Pubblicate</w:t>
+            </w:r>
+          </w:p>
+        </w:tc>
+        <w:tc>
+          <w:tcPr/>
+          <w:p>
+            <w:pPr>
+              <w:pStyle w:val="Compact"/>
+              <w:jc w:val="left"/>
+            </w:pPr>
+            <w:r>
+              <w:t xml:space="preserve">Head</w:t>
+            </w:r>
+          </w:p>
+        </w:tc>
+      </w:tr>
+      <w:tr>
+        <w:tc>
+          <w:tcPr/>
+          <w:p>
+            <w:pPr>
+              <w:pStyle w:val="Compact"/>
+              <w:jc w:val="left"/>
+            </w:pPr>
+            <w:r>
+              <w:t xml:space="preserve">informativo</w:t>
+            </w:r>
+          </w:p>
+        </w:tc>
+        <w:tc>
+          <w:tcPr/>
+          <w:p>
+            <w:pPr>
+              <w:pStyle w:val="Compact"/>
+              <w:jc w:val="left"/>
+            </w:pPr>
+            <w:r>
+              <w:t xml:space="preserve">379</w:t>
+            </w:r>
+          </w:p>
+        </w:tc>
+        <w:tc>
+          <w:tcPr/>
+          <w:p>
+            <w:pPr>
+              <w:pStyle w:val="Compact"/>
+              <w:jc w:val="left"/>
+            </w:pPr>
+            <w:r>
+              <w:t xml:space="preserve">head-informativo</w:t>
+            </w:r>
+          </w:p>
+        </w:tc>
+      </w:tr>
+      <w:tr>
+        <w:tc>
+          <w:tcPr/>
+          <w:p>
+            <w:pPr>
+              <w:pStyle w:val="Compact"/>
+              <w:jc w:val="left"/>
+            </w:pPr>
+            <w:r>
+              <w:t xml:space="preserve">medici</w:t>
+            </w:r>
+          </w:p>
+        </w:tc>
+        <w:tc>
+          <w:tcPr/>
+          <w:p>
+            <w:pPr>
+              <w:pStyle w:val="Compact"/>
+              <w:jc w:val="left"/>
+            </w:pPr>
+            <w:r>
+              <w:t xml:space="preserve">150</w:t>
+            </w:r>
+          </w:p>
+        </w:tc>
+        <w:tc>
+          <w:tcPr/>
+          <w:p>
+            <w:pPr>
+              <w:pStyle w:val="Compact"/>
+              <w:jc w:val="left"/>
+            </w:pPr>
+            <w:r>
+              <w:t xml:space="preserve">head-medici</w:t>
+            </w:r>
+          </w:p>
+        </w:tc>
+      </w:tr>
+      <w:tr>
+        <w:tc>
+          <w:tcPr/>
+          <w:p>
+            <w:pPr>
+              <w:pStyle w:val="Compact"/>
+              <w:jc w:val="left"/>
+            </w:pPr>
+            <w:r>
+              <w:t xml:space="preserve">generica</w:t>
+            </w:r>
+          </w:p>
+        </w:tc>
+        <w:tc>
+          <w:tcPr/>
+          <w:p>
+            <w:pPr>
+              <w:pStyle w:val="Compact"/>
+              <w:jc w:val="left"/>
+            </w:pPr>
+            <w:r>
+              <w:t xml:space="preserve">64</w:t>
+            </w:r>
+          </w:p>
+        </w:tc>
+        <w:tc>
+          <w:tcPr/>
+          <w:p>
+            <w:pPr>
+              <w:pStyle w:val="Compact"/>
+              <w:jc w:val="left"/>
+            </w:pPr>
+            <w:r>
+              <w:t xml:space="preserve">head, head-paginazione (30-34)</w:t>
+            </w:r>
+          </w:p>
+        </w:tc>
+      </w:tr>
+      <w:tr>
+        <w:tc>
+          <w:tcPr/>
+          <w:p>
+            <w:pPr>
+              <w:pStyle w:val="Compact"/>
+              <w:jc w:val="left"/>
+            </w:pPr>
+            <w:r>
+              <w:t xml:space="preserve">strutture + strutture-VDP</w:t>
+            </w:r>
+          </w:p>
+        </w:tc>
+        <w:tc>
+          <w:tcPr/>
+          <w:p>
+            <w:pPr>
+              <w:pStyle w:val="Compact"/>
+              <w:jc w:val="left"/>
+            </w:pPr>
+            <w:r>
+              <w:t xml:space="preserve">64</w:t>
+            </w:r>
+          </w:p>
+        </w:tc>
+        <w:tc>
+          <w:tcPr/>
+          <w:p>
+            <w:pPr>
+              <w:pStyle w:val="Compact"/>
+              <w:jc w:val="left"/>
+            </w:pPr>
+            <w:r>
+              <w:t xml:space="preserve">head-strutture</w:t>
+            </w:r>
+          </w:p>
+        </w:tc>
+      </w:tr>
+      <w:tr>
+        <w:tc>
+          <w:tcPr/>
+          <w:p>
+            <w:pPr>
+              <w:pStyle w:val="Compact"/>
+              <w:jc w:val="left"/>
+            </w:pPr>
+            <w:r>
+              <w:t xml:space="preserve">convenzioni</w:t>
+            </w:r>
+          </w:p>
+        </w:tc>
+        <w:tc>
+          <w:tcPr/>
+          <w:p>
+            <w:pPr>
+              <w:pStyle w:val="Compact"/>
+              <w:jc w:val="left"/>
+            </w:pPr>
+            <w:r>
+              <w:t xml:space="preserve">60</w:t>
+            </w:r>
+          </w:p>
+        </w:tc>
+        <w:tc>
+          <w:tcPr/>
+          <w:p>
+            <w:pPr>
+              <w:pStyle w:val="Compact"/>
+              <w:jc w:val="left"/>
+            </w:pPr>
+            <w:r>
+              <w:t xml:space="preserve">head</w:t>
+            </w:r>
+          </w:p>
+        </w:tc>
+      </w:tr>
+      <w:tr>
+        <w:tc>
+          <w:tcPr/>
+          <w:p>
+            <w:pPr>
+              <w:pStyle w:val="Compact"/>
+              <w:jc w:val="left"/>
+            </w:pPr>
+            <w:r>
+              <w:t xml:space="preserve">cure</w:t>
+            </w:r>
+          </w:p>
+        </w:tc>
+        <w:tc>
+          <w:tcPr/>
+          <w:p>
+            <w:pPr>
+              <w:pStyle w:val="Compact"/>
+              <w:jc w:val="left"/>
+            </w:pPr>
+            <w:r>
+              <w:t xml:space="preserve">55</w:t>
+            </w:r>
+          </w:p>
+        </w:tc>
+        <w:tc>
+          <w:tcPr/>
+          <w:p>
+            <w:pPr>
+              <w:pStyle w:val="Compact"/>
+              <w:jc w:val="left"/>
+            </w:pPr>
+            <w:r>
+              <w:t xml:space="preserve">head</w:t>
+            </w:r>
+          </w:p>
+        </w:tc>
+      </w:tr>
+      <w:tr>
+        <w:tc>
+          <w:tcPr/>
+          <w:p>
+            <w:pPr>
+              <w:pStyle w:val="Compact"/>
+              <w:jc w:val="left"/>
+            </w:pPr>
+            <w:r>
+              <w:t xml:space="preserve">specializzazioni</w:t>
+            </w:r>
+          </w:p>
+        </w:tc>
+        <w:tc>
+          <w:tcPr/>
+          <w:p>
+            <w:pPr>
+              <w:pStyle w:val="Compact"/>
+              <w:jc w:val="left"/>
+            </w:pPr>
+            <w:r>
+              <w:t xml:space="preserve">42</w:t>
+            </w:r>
+          </w:p>
+        </w:tc>
+        <w:tc>
+          <w:tcPr/>
+          <w:p>
+            <w:pPr>
+              <w:pStyle w:val="Compact"/>
+              <w:jc w:val="left"/>
+            </w:pPr>
+            <w:r>
+              <w:t xml:space="preserve">head-specializzazioni</w:t>
+            </w:r>
+          </w:p>
+        </w:tc>
+      </w:tr>
+      <w:tr>
+        <w:tc>
+          <w:tcPr/>
+          <w:p>
+            <w:pPr>
+              <w:pStyle w:val="Compact"/>
+              <w:jc w:val="left"/>
+            </w:pPr>
+            <w:r>
+              <w:t xml:space="preserve">tecnologie</w:t>
+            </w:r>
+          </w:p>
+        </w:tc>
+        <w:tc>
+          <w:tcPr/>
+          <w:p>
+            <w:pPr>
+              <w:pStyle w:val="Compact"/>
+              <w:jc w:val="left"/>
+            </w:pPr>
+            <w:r>
+              <w:t xml:space="preserve">23</w:t>
+            </w:r>
+          </w:p>
+        </w:tc>
+        <w:tc>
+          <w:tcPr/>
+          <w:p>
+            <w:pPr>
+              <w:pStyle w:val="Compact"/>
+              <w:jc w:val="left"/>
+            </w:pPr>
+            <w:r>
+              <w:t xml:space="preserve">head-informativo</w:t>
+            </w:r>
+          </w:p>
+        </w:tc>
+      </w:tr>
+      <w:tr>
+        <w:tc>
+          <w:tcPr/>
+          <w:p>
+            <w:pPr>
+              <w:pStyle w:val="Compact"/>
+              <w:jc w:val="left"/>
+            </w:pPr>
+            <w:r>
+              <w:t xml:space="preserve">landing</w:t>
+            </w:r>
+          </w:p>
+        </w:tc>
+        <w:tc>
+          <w:tcPr/>
+          <w:p>
+            <w:pPr>
+              <w:pStyle w:val="Compact"/>
+              <w:jc w:val="left"/>
+            </w:pPr>
+            <w:r>
+              <w:t xml:space="preserve">22</w:t>
+            </w:r>
+          </w:p>
+        </w:tc>
+        <w:tc>
+          <w:tcPr/>
+          <w:p>
+            <w:pPr>
+              <w:pStyle w:val="Compact"/>
+              <w:jc w:val="left"/>
+            </w:pPr>
+            <w:r>
+              <w:t xml:space="preserve">head-landing</w:t>
+            </w:r>
+          </w:p>
+        </w:tc>
+      </w:tr>
+      <w:tr>
+        <w:tc>
+          <w:tcPr/>
+          <w:p>
+            <w:pPr>
+              <w:pStyle w:val="Compact"/>
+              <w:jc w:val="left"/>
+            </w:pPr>
+            <w:r>
+              <w:t xml:space="preserve">video</w:t>
+            </w:r>
+          </w:p>
+        </w:tc>
+        <w:tc>
+          <w:tcPr/>
+          <w:p>
+            <w:pPr>
+              <w:pStyle w:val="Compact"/>
+              <w:jc w:val="left"/>
+            </w:pPr>
+            <w:r>
+              <w:t xml:space="preserve">21</w:t>
+            </w:r>
+          </w:p>
+        </w:tc>
+        <w:tc>
+          <w:tcPr/>
+          <w:p>
+            <w:pPr>
+              <w:pStyle w:val="Compact"/>
+              <w:jc w:val="left"/>
+            </w:pPr>
+            <w:r>
+              <w:t xml:space="preserve">head-video</w:t>
+            </w:r>
+          </w:p>
+        </w:tc>
+      </w:tr>
+      <w:tr>
+        <w:tc>
+          <w:tcPr/>
+          <w:p>
+            <w:pPr>
+              <w:pStyle w:val="Compact"/>
+              <w:jc w:val="left"/>
+            </w:pPr>
+            <w:r>
+              <w:t xml:space="preserve">generica-en</w:t>
+            </w:r>
+          </w:p>
+        </w:tc>
+        <w:tc>
+          <w:tcPr/>
+          <w:p>
+            <w:pPr>
+              <w:pStyle w:val="Compact"/>
+              <w:jc w:val="left"/>
+            </w:pPr>
+            <w:r>
+              <w:t xml:space="preserve">19</w:t>
+            </w:r>
+          </w:p>
+        </w:tc>
+        <w:tc>
+          <w:tcPr/>
+          <w:p>
+            <w:pPr>
+              <w:pStyle w:val="Compact"/>
+              <w:jc w:val="left"/>
+            </w:pPr>
+            <w:r>
+              <w:t xml:space="preserve">head-en</w:t>
+            </w:r>
+          </w:p>
+        </w:tc>
+      </w:tr>
+      <w:tr>
+        <w:tc>
+          <w:tcPr/>
+          <w:p>
+            <w:pPr>
+              <w:pStyle w:val="Compact"/>
+              <w:jc w:val="left"/>
+            </w:pPr>
+            <w:r>
+              <w:t xml:space="preserve">progetti-speciali, news-media</w:t>
+            </w:r>
+          </w:p>
+        </w:tc>
+        <w:tc>
+          <w:tcPr/>
+          <w:p>
+            <w:pPr>
+              <w:pStyle w:val="Compact"/>
+              <w:jc w:val="left"/>
+            </w:pPr>
+            <w:r>
+              <w:t xml:space="preserve">2 + 1</w:t>
+            </w:r>
+          </w:p>
+        </w:tc>
+        <w:tc>
+          <w:tcPr/>
+          <w:p>
+            <w:pPr>
+              <w:pStyle w:val="Compact"/>
+              <w:jc w:val="left"/>
+            </w:pPr>
+            <w:r>
+              <w:t xml:space="preserve">head-informativo, head-paginazione</w:t>
+            </w:r>
+          </w:p>
+        </w:tc>
+      </w:tr>
+      <w:tr>
+        <w:tc>
+          <w:tcPr/>
+          <w:p>
+            <w:pPr>
+              <w:pStyle w:val="Compact"/>
+              <w:jc w:val="left"/>
+            </w:pPr>
+            <w:r>
+              <w:t xml:space="preserve">report-recruiting, KOS 2025 Gallery</w:t>
+            </w:r>
+          </w:p>
+        </w:tc>
+        <w:tc>
+          <w:tcPr/>
+          <w:p>
+            <w:pPr>
+              <w:pStyle w:val="Compact"/>
+              <w:jc w:val="left"/>
+            </w:pPr>
+            <w:r>
+              <w:t xml:space="preserve">2 + 1</w:t>
+            </w:r>
+          </w:p>
+        </w:tc>
+        <w:tc>
+          <w:tcPr/>
+          <w:p>
+            <w:pPr>
+              <w:pStyle w:val="Compact"/>
+              <w:jc w:val="left"/>
+            </w:pPr>
+            <w:r>
+              <w:t xml:space="preserve">head nel template</w:t>
+            </w:r>
+          </w:p>
+        </w:tc>
+      </w:tr>
+      <w:tr>
+        <w:tc>
+          <w:tcPr/>
+          <w:p>
+            <w:pPr>
+              <w:pStyle w:val="Compact"/>
+              <w:jc w:val="left"/>
+            </w:pPr>
+            <w:r>
+              <w:t xml:space="preserve">comunicati</w:t>
+            </w:r>
+          </w:p>
+        </w:tc>
+        <w:tc>
+          <w:tcPr/>
+          <w:p>
+            <w:pPr>
+              <w:pStyle w:val="Compact"/>
+              <w:jc w:val="left"/>
+            </w:pPr>
+            <w:r>
+              <w:t xml:space="preserve">50 (non ricercabili)</w:t>
+            </w:r>
+          </w:p>
+        </w:tc>
+        <w:tc>
+          <w:tcPr/>
+          <w:p>
+            <w:pPr>
+              <w:pStyle w:val="Compact"/>
+              <w:jc w:val="left"/>
+            </w:pPr>
+            <w:r>
+              <w:t xml:space="preserve">nessuno: lo snippet</w:t>
+            </w:r>
+            <w:r>
+              <w:t xml:space="preserve"> </w:t>
+            </w:r>
+            <w:r>
+              <w:rPr>
+                <w:rStyle w:val="VerbatimChar"/>
+              </w:rPr>
+              <w:t xml:space="preserve">comunicatoRedirect</w:t>
+            </w:r>
+            <w:r>
+              <w:t xml:space="preserve"> </w:t>
+            </w:r>
+            <w:r>
+              <w:t xml:space="preserve">rimanda con 301 al PDF</w:t>
+            </w:r>
+          </w:p>
+        </w:tc>
+      </w:tr>
+      <w:tr>
+        <w:tc>
+          <w:tcPr/>
+          <w:p>
+            <w:pPr>
+              <w:pStyle w:val="Compact"/>
+              <w:jc w:val="left"/>
+            </w:pPr>
+            <w:r>
+              <w:t xml:space="preserve">form-iscrizione, strutture-test, AccessibilityDashboard, BaseTemplate</w:t>
+            </w:r>
+          </w:p>
+        </w:tc>
+        <w:tc>
+          <w:tcPr/>
+          <w:p>
+            <w:pPr>
+              <w:pStyle w:val="Compact"/>
+              <w:jc w:val="left"/>
+            </w:pPr>
+            <w:r>
+              <w:t xml:space="preserve">0</w:t>
+            </w:r>
+          </w:p>
+        </w:tc>
+        <w:tc>
+          <w:tcPr/>
+          <w:p>
+            <w:pPr>
+              <w:pStyle w:val="Compact"/>
+              <w:jc w:val="left"/>
+            </w:pPr>
+            <w:r>
+              <w:t xml:space="preserve">non in uso</w:t>
+            </w:r>
+          </w:p>
+        </w:tc>
+      </w:tr>
+    </w:tbl>
+    <w:p>
+      <w:pPr>
+        <w:pStyle w:val="BodyText"/>
+      </w:pPr>
+      <w:r>
+        <w:t xml:space="preserve">Il consolidamento copre 13 template e 902 pagine pubblicate.</w:t>
+      </w:r>
+      <w:r>
+        <w:t xml:space="preserve"> </w:t>
+      </w:r>
+      <w:r>
+        <w:rPr>
+          <w:rStyle w:val="VerbatimChar"/>
+        </w:rPr>
+        <w:t xml:space="preserve">head-formazione</w:t>
+      </w:r>
+      <w:r>
+        <w:t xml:space="preserve"> </w:t>
+      </w:r>
+      <w:r>
+        <w:t xml:space="preserve">e</w:t>
+      </w:r>
+      <w:r>
+        <w:t xml:space="preserve"> </w:t>
+      </w:r>
+      <w:r>
+        <w:rPr>
+          <w:rStyle w:val="VerbatimChar"/>
+        </w:rPr>
+        <w:t xml:space="preserve">head-strutture-test</w:t>
+      </w:r>
+      <w:r>
+        <w:t xml:space="preserve"> </w:t>
+      </w:r>
+      <w:r>
+        <w:t xml:space="preserve">non servono</w:t>
+      </w:r>
+      <w:r>
+        <w:t xml:space="preserve"> </w:t>
+      </w:r>
+      <w:r>
+        <w:t xml:space="preserve">pagine pubblicate: il tracciamento di prova non è attivo (si possono archiviare con i template inutilizzati, d'accordo</w:t>
+      </w:r>
+      <w:r>
+        <w:t xml:space="preserve"> </w:t>
+      </w:r>
+      <w:r>
+        <w:t xml:space="preserve">con KOS). I 3 template con head interno e pagine pubblicate (2 report, 1 galleria) si allineano a parte, con poco lavoro.</w:t>
+      </w:r>
+    </w:p>
     <w:bookmarkEnd w:id="20"/>
-    <w:bookmarkStart w:id="21" w:name="problemi"/>
+    <w:bookmarkEnd w:id="21"/>
+    <w:bookmarkStart w:id="22" w:name="problemi"/>
     <w:p>
       <w:pPr>
         <w:pStyle w:val="Heading2"/>
@@ -1472,8 +2183,8 @@
         <w:t xml:space="preserve">di GA4. Da verificare quali risorse lo usano.</w:t>
       </w:r>
     </w:p>
-    <w:bookmarkEnd w:id="21"/>
-    <w:bookmarkStart w:id="22" w:name="proposta"/>
+    <w:bookmarkEnd w:id="22"/>
+    <w:bookmarkStart w:id="23" w:name="proposta"/>
     <w:p>
       <w:pPr>
         <w:pStyle w:val="Heading2"/>
@@ -2027,8 +2738,8 @@
         <w:t xml:space="preserve">pubblicate).</w:t>
       </w:r>
     </w:p>
-    <w:bookmarkEnd w:id="22"/>
-    <w:bookmarkStart w:id="23" w:name="collaudo"/>
+    <w:bookmarkEnd w:id="23"/>
+    <w:bookmarkStart w:id="24" w:name="collaudo"/>
     <w:p>
       <w:pPr>
         <w:pStyle w:val="Heading2"/>
@@ -2130,8 +2841,8 @@
         <w:t xml:space="preserve">misura del tempo di risposta a cache calda prima e dopo (per KOS-2).</w:t>
       </w:r>
     </w:p>
-    <w:bookmarkEnd w:id="23"/>
-    <w:bookmarkStart w:id="24" w:name="domande-aperte"/>
+    <w:bookmarkEnd w:id="24"/>
+    <w:bookmarkStart w:id="25" w:name="domande-aperte"/>
     <w:p>
       <w:pPr>
         <w:pStyle w:val="Heading2"/>
@@ -2167,73 +2878,16 @@
         <w:pStyle w:val="Compact"/>
       </w:pPr>
       <w:r>
-        <w:t xml:space="preserve">Template</w:t>
-      </w:r>
-      <w:r>
-        <w:t xml:space="preserve"> </w:t>
-      </w:r>
-      <w:r>
-        <w:rPr>
-          <w:rStyle w:val="VerbatimChar"/>
-        </w:rPr>
-        <w:t xml:space="preserve">strutture-test</w:t>
-      </w:r>
-      <w:r>
-        <w:t xml:space="preserve">,</w:t>
-      </w:r>
-      <w:r>
-        <w:t xml:space="preserve"> </w:t>
-      </w:r>
-      <w:r>
-        <w:rPr>
-          <w:rStyle w:val="VerbatimChar"/>
-        </w:rPr>
-        <w:t xml:space="preserve">AccessibilityDashboard</w:t>
-      </w:r>
-      <w:r>
-        <w:t xml:space="preserve">,</w:t>
-      </w:r>
-      <w:r>
-        <w:t xml:space="preserve"> </w:t>
-      </w:r>
-      <w:r>
-        <w:rPr>
-          <w:rStyle w:val="VerbatimChar"/>
-        </w:rPr>
-        <w:t xml:space="preserve">BaseTemplate</w:t>
-      </w:r>
-      <w:r>
-        <w:t xml:space="preserve">,</w:t>
-      </w:r>
-      <w:r>
-        <w:t xml:space="preserve"> </w:t>
-      </w:r>
-      <w:r>
-        <w:rPr>
-          <w:rStyle w:val="VerbatimChar"/>
-        </w:rPr>
-        <w:t xml:space="preserve">KOS_2025_Gallery</w:t>
-      </w:r>
-      <w:r>
-        <w:t xml:space="preserve">,</w:t>
-      </w:r>
-      <w:r>
-        <w:t xml:space="preserve"> </w:t>
-      </w:r>
-      <w:r>
-        <w:rPr>
-          <w:rStyle w:val="VerbatimChar"/>
-        </w:rPr>
-        <w:t xml:space="preserve">report-recruiting</w:t>
-      </w:r>
-      <w:r>
-        <w:t xml:space="preserve">: quali</w:t>
-      </w:r>
-      <w:r>
-        <w:t xml:space="preserve"> </w:t>
-      </w:r>
-      <w:r>
-        <w:t xml:space="preserve">risorse pubblicate li usano?</w:t>
+        <w:rPr>
+          <w:strike/>
+        </w:rPr>
+        <w:t xml:space="preserve">Template di test e con head interno: quali pagine li usano?</w:t>
+      </w:r>
+      <w:r>
+        <w:t xml:space="preserve"> </w:t>
+      </w:r>
+      <w:r>
+        <w:t xml:space="preserve">Risolto il 24/10 (tabella sopra).</w:t>
       </w:r>
     </w:p>
     <w:p>
@@ -2248,8 +2902,8 @@
         <w:t xml:space="preserve">Barra di ricerca Yext Answers: con cosa la sostituiamo e quando (linea C)?</w:t>
       </w:r>
     </w:p>
-    <w:bookmarkEnd w:id="24"/>
     <w:bookmarkEnd w:id="25"/>
+    <w:bookmarkEnd w:id="26"/>
     <w:sectPr/>
   </w:body>
 </w:document>

</xml_diff>

<commit_message>
KOS-2 voce 24 head: ripiego della descrizione og senza nome di campo dinamico; controllo con canonical dello stage, immagini con autenticazione, campione dei soli template consolidati
Co-Authored-By: Claude Opus 5.5 <noreply@anthropic.com>
Claude-Session: https://claude.ai/code/session_01Rr1X44gsg7BUwMzrRvYrc2
</commit_message>
<xml_diff>
--- a/docs/docx/kos-head-consolidamento.docx
+++ b/docs/docx/kos-head-consolidamento.docx
@@ -2925,15 +2925,6 @@
               <w:rPr>
                 <w:rStyle w:val="VerbatimChar"/>
               </w:rPr>
-              <w:t xml:space="preserve"> &amp;ogDescrizione=</w:t>
-            </w:r>
-            <w:r>
-              <w:t xml:space="preserve">introtext</w:t>
-            </w:r>
-            <w:r>
-              <w:rPr>
-                <w:rStyle w:val="VerbatimChar"/>
-              </w:rPr>
               <w:t xml:space="preserve">]]</w:t>
             </w:r>
           </w:p>
@@ -2981,7 +2972,7 @@
               <w:t xml:space="preserve">[[$head? &amp;ogDescrizione=</w:t>
             </w:r>
             <w:r>
-              <w:t xml:space="preserve">ruolo</w:t>
+              <w:t xml:space="preserve">[[*ruolo]]</w:t>
             </w:r>
             <w:r>
               <w:rPr>
@@ -3023,15 +3014,6 @@
             </w:r>
             <w:r>
               <w:t xml:space="preserve">video.other</w:t>
-            </w:r>
-            <w:r>
-              <w:rPr>
-                <w:rStyle w:val="VerbatimChar"/>
-              </w:rPr>
-              <w:t xml:space="preserve"> &amp;ogDescrizione=</w:t>
-            </w:r>
-            <w:r>
-              <w:t xml:space="preserve">introtext</w:t>
             </w:r>
             <w:r>
               <w:rPr>

</xml_diff>

<commit_message>
KOS-2 voce 24 head: tempo di risposta con l'head vecchio e con il nuovo sullo stage (nessuna differenza)
Co-Authored-By: Claude Opus 5.5 <noreply@anthropic.com>
Claude-Session: https://claude.ai/code/session_01Rr1X44gsg7BUwMzrRvYrc2
</commit_message>
<xml_diff>
--- a/docs/docx/kos-head-consolidamento.docx
+++ b/docs/docx/kos-head-consolidamento.docx
@@ -3521,6 +3521,56 @@
       </w:r>
       <w:r>
         <w:t xml:space="preserve">senza versione scritta a mano.</w:t>
+      </w:r>
+    </w:p>
+    <w:p>
+      <w:pPr>
+        <w:pStyle w:val="BodyText"/>
+      </w:pPr>
+      <w:r>
+        <w:t xml:space="preserve">Tempo di risposta sullo stage (24/10, 54 pagine, mediana di 5 misure a cache calda,</w:t>
+      </w:r>
+      <w:r>
+        <w:t xml:space="preserve"> </w:t>
+      </w:r>
+      <w:r>
+        <w:rPr>
+          <w:rStyle w:val="VerbatimChar"/>
+        </w:rPr>
+        <w:t xml:space="preserve">collaudo-visivo.mjs --tempi</w:t>
+      </w:r>
+      <w:r>
+        <w:t xml:space="preserve">),</w:t>
+      </w:r>
+      <w:r>
+        <w:t xml:space="preserve"> </w:t>
+      </w:r>
+      <w:r>
+        <w:t xml:space="preserve">misurato con l'head vecchio (ripristinato per la prova) e con il nuovo: stage/produzione 1,60 con il vecchio e 1,61 con il</w:t>
+      </w:r>
+      <w:r>
+        <w:t xml:space="preserve"> </w:t>
+      </w:r>
+      <w:r>
+        <w:t xml:space="preserve">nuovo, differenza sulla stessa pagina dello stage −2 ms in mediana. L'head unico non cambia il tempo di risposta; lo</w:t>
+      </w:r>
+      <w:r>
+        <w:t xml:space="preserve"> </w:t>
+      </w:r>
+      <w:r>
+        <w:t xml:space="preserve">stage è più lento della produzione (circa +90 ms) perché è un cloud di sviluppo: un file statico risponde uguale sui due.</w:t>
+      </w:r>
+      <w:r>
+        <w:t xml:space="preserve"> </w:t>
+      </w:r>
+      <w:r>
+        <w:t xml:space="preserve">Da approfondire per KOS-2: le pagine inglesi rispondono circa 100 ms più lente delle italiane anche in produzione</w:t>
+      </w:r>
+      <w:r>
+        <w:t xml:space="preserve"> </w:t>
+      </w:r>
+      <w:r>
+        <w:t xml:space="preserve">(mediana 210 contro 120 ms).</w:t>
       </w:r>
     </w:p>
     <w:p>

</xml_diff>